<commit_message>
Expand slide deck 104 -> 151 slides; fix latent takeaway() overlap
Adds 47 concept slides across the four topic sections, drawn from the
fact-checked v2.0 Learner Guide content. The admin and wrap-up blocks are
untouched — their ordering is governed by WSQ hard rules.

  Topic 1  12 -> 20   Topic 2  17 -> 29
  Topic 3  18 -> 30   Topic 4  16 -> 31

Fixes a pre-existing defect in the shared takeaway() helper: the band was
drawn over the bottom row of whatever grid it decorated, clipping content on
existing slides as well as new ones. It now compresses the body into the space
above the band.

Also fixed: adapter tile grid clipping captions mid-word, an RBAC cell
overflowing its row, an env-var name wrapping mid-token, and a decision_map
with YES on amber and NO on green.

The Lesson Plan's Slides column recomputed itself from the rebuilt deck, as
designed — no manual remapping was needed.

Co-Authored-By: Claude Opus 5 (1M context) <noreply@anthropic.com>
</commit_message>
<xml_diff>
--- a/courseware/LP-Manage AI Agents with Paperclip (TGS-2023036646).docx
+++ b/courseware/LP-Manage AI Agents with Paperclip (TGS-2023036646).docx
@@ -1110,7 +1110,7 @@
                 <w:b w:val="0"/>
                 <w:sz w:val="19"/>
               </w:rPr>
-              <w:t>31-37</w:t>
+              <w:t>31-45</w:t>
             </w:r>
           </w:p>
         </w:tc>
@@ -1251,7 +1251,7 @@
                 <w:b w:val="0"/>
                 <w:sz w:val="19"/>
               </w:rPr>
-              <w:t>38-42</w:t>
+              <w:t>46-50</w:t>
             </w:r>
           </w:p>
         </w:tc>
@@ -1396,7 +1396,7 @@
                 <w:b w:val="0"/>
                 <w:sz w:val="19"/>
               </w:rPr>
-              <w:t>43-50</w:t>
+              <w:t>51-70</w:t>
             </w:r>
           </w:p>
         </w:tc>
@@ -1537,7 +1537,7 @@
                 <w:b w:val="0"/>
                 <w:sz w:val="19"/>
               </w:rPr>
-              <w:t>51-59</w:t>
+              <w:t>71-79</w:t>
             </w:r>
           </w:p>
         </w:tc>
@@ -1860,7 +1860,7 @@
                 <w:b w:val="0"/>
                 <w:sz w:val="19"/>
               </w:rPr>
-              <w:t>60-68</w:t>
+              <w:t>80-100</w:t>
             </w:r>
           </w:p>
         </w:tc>
@@ -2001,7 +2001,7 @@
                 <w:b w:val="0"/>
                 <w:sz w:val="19"/>
               </w:rPr>
-              <w:t>69-77</w:t>
+              <w:t>101-109</w:t>
             </w:r>
           </w:p>
         </w:tc>
@@ -2146,7 +2146,7 @@
                 <w:b w:val="0"/>
                 <w:sz w:val="19"/>
               </w:rPr>
-              <w:t>78-88</w:t>
+              <w:t>110-135</w:t>
             </w:r>
           </w:p>
         </w:tc>
@@ -2287,7 +2287,7 @@
                 <w:b w:val="0"/>
                 <w:sz w:val="19"/>
               </w:rPr>
-              <w:t>89-93</w:t>
+              <w:t>136-140</w:t>
             </w:r>
           </w:p>
         </w:tc>
@@ -2360,7 +2360,7 @@
                 <w:b w:val="0"/>
                 <w:sz w:val="19"/>
               </w:rPr>
-              <w:t>94-104</w:t>
+              <w:t>141-151</w:t>
             </w:r>
           </w:p>
         </w:tc>
@@ -2433,7 +2433,7 @@
                 <w:b w:val="0"/>
                 <w:sz w:val="19"/>
               </w:rPr>
-              <w:t>94-104</w:t>
+              <w:t>141-151</w:t>
             </w:r>
           </w:p>
         </w:tc>
@@ -2506,7 +2506,7 @@
                 <w:b w:val="0"/>
                 <w:sz w:val="19"/>
               </w:rPr>
-              <w:t>94-104</w:t>
+              <w:t>141-151</w:t>
             </w:r>
           </w:p>
         </w:tc>
@@ -2579,7 +2579,7 @@
                 <w:b w:val="0"/>
                 <w:sz w:val="19"/>
               </w:rPr>
-              <w:t>94-104</w:t>
+              <w:t>141-151</w:t>
             </w:r>
           </w:p>
         </w:tc>

</xml_diff>